<commit_message>
Update Alexander Kruger - CV.docx
</commit_message>
<xml_diff>
--- a/Alexander Kruger - CV.docx
+++ b/Alexander Kruger - CV.docx
@@ -539,7 +539,7 @@
           </mc:Choice>
           <mc:Fallback>
             <w:pict>
-              <v:line w14:anchorId="2629544C" id="Shape 3" o:spid="_x0000_s1026" style="position:absolute;z-index:251618816;visibility:visible;mso-wrap-style:square;mso-width-percent:0;mso-height-percent:0;mso-wrap-distance-left:0;mso-wrap-distance-top:0;mso-wrap-distance-right:0;mso-wrap-distance-bottom:0;mso-position-horizontal:absolute;mso-position-horizontal-relative:text;mso-position-vertical:absolute;mso-position-vertical-relative:text;mso-width-percent:0;mso-height-percent:0;mso-width-relative:page;mso-height-relative:page" from="-1.4pt,4.5pt" to="525.2pt,4.5pt" o:gfxdata="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" o:allowincell="f" strokecolor="#4f81bd" strokeweight=".25397mm"/>
+              <v:line w14:anchorId="5F8C3B2A" id="Shape 3" o:spid="_x0000_s1026" style="position:absolute;z-index:251618816;visibility:visible;mso-wrap-style:square;mso-width-percent:0;mso-height-percent:0;mso-wrap-distance-left:0;mso-wrap-distance-top:0;mso-wrap-distance-right:0;mso-wrap-distance-bottom:0;mso-position-horizontal:absolute;mso-position-horizontal-relative:text;mso-position-vertical:absolute;mso-position-vertical-relative:text;mso-width-percent:0;mso-height-percent:0;mso-width-relative:page;mso-height-relative:page" from="-1.4pt,4.5pt" to="525.2pt,4.5pt" o:gfxdata="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" o:allowincell="f" strokecolor="#4f81bd" strokeweight=".25397mm"/>
             </w:pict>
           </mc:Fallback>
         </mc:AlternateContent>
@@ -985,7 +985,7 @@
           <w:tab w:val="left" w:pos="5020"/>
         </w:tabs>
         <w:spacing w:line="238" w:lineRule="auto"/>
-        <w:ind w:left="3400" w:right="-1101"/>
+        <w:ind w:left="5760" w:right="-1101" w:hanging="2360"/>
         <w:rPr>
           <w:rFonts w:ascii="Verdana" w:hAnsi="Verdana"/>
           <w:sz w:val="20"/>
@@ -1016,55 +1016,7 @@
           <w:sz w:val="20"/>
           <w:szCs w:val="20"/>
         </w:rPr>
-        <w:t>Drivers</w:t>
-      </w:r>
-      <w:r>
-        <w:rPr>
-          <w:rFonts w:ascii="Verdana" w:eastAsia="Calibri" w:hAnsi="Verdana" w:cs="Calibri"/>
-          <w:sz w:val="20"/>
-          <w:szCs w:val="20"/>
-        </w:rPr>
-        <w:t xml:space="preserve"> licence</w:t>
-      </w:r>
-      <w:r>
-        <w:rPr>
-          <w:rFonts w:ascii="Verdana" w:eastAsia="Calibri" w:hAnsi="Verdana" w:cs="Calibri"/>
-          <w:sz w:val="20"/>
-          <w:szCs w:val="20"/>
-        </w:rPr>
-        <w:t xml:space="preserve"> - Number</w:t>
-      </w:r>
-      <w:r>
-        <w:rPr>
-          <w:rFonts w:ascii="Verdana" w:eastAsia="Calibri" w:hAnsi="Verdana" w:cs="Calibri"/>
-          <w:sz w:val="20"/>
-          <w:szCs w:val="20"/>
-        </w:rPr>
-        <w:t xml:space="preserve"> </w:t>
-      </w:r>
-      <w:r>
-        <w:rPr>
-          <w:rFonts w:ascii="Verdana" w:eastAsia="Calibri" w:hAnsi="Verdana" w:cs="Calibri"/>
-          <w:sz w:val="20"/>
-          <w:szCs w:val="20"/>
-        </w:rPr>
-        <w:t>–</w:t>
-      </w:r>
-      <w:r>
-        <w:rPr>
-          <w:rFonts w:ascii="Verdana" w:eastAsia="Calibri" w:hAnsi="Verdana" w:cs="Calibri"/>
-          <w:sz w:val="20"/>
-          <w:szCs w:val="20"/>
-        </w:rPr>
-        <w:t xml:space="preserve"> </w:t>
-      </w:r>
-      <w:r>
-        <w:rPr>
-          <w:rFonts w:ascii="Verdana" w:eastAsia="Calibri" w:hAnsi="Verdana" w:cs="Calibri"/>
-          <w:sz w:val="20"/>
-          <w:szCs w:val="20"/>
-        </w:rPr>
-        <w:t>4311000BKXN</w:t>
+        <w:t>Valid Code B Driver's Licence (Licence No: 4311000BKXN) — Reliable Transport</w:t>
       </w:r>
     </w:p>
     <w:p>
@@ -1075,9 +1027,9 @@
         <w:spacing w:line="226" w:lineRule="auto"/>
         <w:ind w:left="3400"/>
         <w:rPr>
-          <w:rFonts w:ascii="Verdana" w:hAnsi="Verdana"/>
-          <w:sz w:val="20"/>
-          <w:szCs w:val="20"/>
+          <w:rFonts w:ascii="Verdana" w:eastAsia="Calibri" w:hAnsi="Verdana" w:cs="Calibri"/>
+          <w:sz w:val="19"/>
+          <w:szCs w:val="19"/>
         </w:rPr>
       </w:pPr>
       <w:r>
@@ -1125,6 +1077,200 @@
     </w:p>
     <w:p>
       <w:pPr>
+        <w:tabs>
+          <w:tab w:val="left" w:pos="5020"/>
+        </w:tabs>
+        <w:spacing w:line="226" w:lineRule="auto"/>
+        <w:ind w:left="3400"/>
+        <w:rPr>
+          <w:rFonts w:ascii="Verdana" w:hAnsi="Verdana"/>
+          <w:sz w:val="20"/>
+          <w:szCs w:val="20"/>
+        </w:rPr>
+      </w:pPr>
+      <w:r>
+        <w:rPr>
+          <w:rFonts w:ascii="Verdana" w:eastAsia="Calibri" w:hAnsi="Verdana" w:cs="Calibri"/>
+          <w:b/>
+          <w:bCs/>
+          <w:sz w:val="20"/>
+          <w:szCs w:val="20"/>
+        </w:rPr>
+        <w:t>GitHub Portfolio:</w:t>
+      </w:r>
+      <w:r>
+        <w:rPr>
+          <w:rFonts w:ascii="Verdana" w:hAnsi="Verdana"/>
+          <w:sz w:val="20"/>
+          <w:szCs w:val="20"/>
+        </w:rPr>
+        <w:tab/>
+      </w:r>
+      <w:hyperlink r:id="rId7" w:history="1">
+        <w:r>
+          <w:rPr>
+            <w:rStyle w:val="Hyperlink"/>
+            <w:rFonts w:ascii="Verdana" w:hAnsi="Verdana"/>
+            <w:sz w:val="20"/>
+            <w:szCs w:val="20"/>
+          </w:rPr>
+          <w:t xml:space="preserve">Alexander-Kruger - </w:t>
+        </w:r>
+        <w:r>
+          <w:rPr>
+            <w:rStyle w:val="Hyperlink"/>
+            <w:rFonts w:ascii="Verdana" w:hAnsi="Verdana"/>
+            <w:sz w:val="20"/>
+            <w:szCs w:val="20"/>
+          </w:rPr>
+          <w:t>GitHub</w:t>
+        </w:r>
+      </w:hyperlink>
+    </w:p>
+    <w:p>
+      <w:pPr>
+        <w:tabs>
+          <w:tab w:val="left" w:pos="5020"/>
+        </w:tabs>
+        <w:spacing w:line="226" w:lineRule="auto"/>
+        <w:ind w:left="3400"/>
+        <w:rPr>
+          <w:rFonts w:ascii="Verdana" w:eastAsia="Calibri" w:hAnsi="Verdana" w:cs="Calibri"/>
+          <w:sz w:val="19"/>
+          <w:szCs w:val="19"/>
+        </w:rPr>
+      </w:pPr>
+      <w:r>
+        <w:rPr>
+          <w:rFonts w:ascii="Verdana" w:eastAsia="Calibri" w:hAnsi="Verdana" w:cs="Calibri"/>
+          <w:b/>
+          <w:bCs/>
+          <w:sz w:val="20"/>
+          <w:szCs w:val="20"/>
+        </w:rPr>
+        <w:t>Citizenship:</w:t>
+      </w:r>
+      <w:r>
+        <w:rPr>
+          <w:rFonts w:ascii="Verdana" w:eastAsia="Calibri" w:hAnsi="Verdana" w:cs="Calibri"/>
+          <w:sz w:val="19"/>
+          <w:szCs w:val="19"/>
+        </w:rPr>
+        <w:t xml:space="preserve"> </w:t>
+      </w:r>
+      <w:r>
+        <w:rPr>
+          <w:rFonts w:ascii="Verdana" w:eastAsia="Calibri" w:hAnsi="Verdana" w:cs="Calibri"/>
+          <w:sz w:val="19"/>
+          <w:szCs w:val="19"/>
+        </w:rPr>
+        <w:tab/>
+      </w:r>
+      <w:r>
+        <w:rPr>
+          <w:rFonts w:ascii="Verdana" w:eastAsia="Calibri" w:hAnsi="Verdana" w:cs="Calibri"/>
+          <w:sz w:val="19"/>
+          <w:szCs w:val="19"/>
+        </w:rPr>
+        <w:tab/>
+      </w:r>
+      <w:r>
+        <w:rPr>
+          <w:rFonts w:ascii="Verdana" w:eastAsia="Calibri" w:hAnsi="Verdana" w:cs="Calibri"/>
+          <w:sz w:val="19"/>
+          <w:szCs w:val="19"/>
+        </w:rPr>
+        <w:tab/>
+      </w:r>
+      <w:r>
+        <w:rPr>
+          <w:rFonts w:ascii="Verdana" w:eastAsia="Calibri" w:hAnsi="Verdana" w:cs="Calibri"/>
+          <w:sz w:val="19"/>
+          <w:szCs w:val="19"/>
+        </w:rPr>
+        <w:t>South African (Permanent Resident)</w:t>
+      </w:r>
+      <w:r>
+        <w:rPr>
+          <w:rFonts w:ascii="Verdana" w:eastAsia="Calibri" w:hAnsi="Verdana" w:cs="Calibri"/>
+          <w:sz w:val="19"/>
+          <w:szCs w:val="19"/>
+        </w:rPr>
+        <w:t xml:space="preserve"> </w:t>
+      </w:r>
+    </w:p>
+    <w:p>
+      <w:pPr>
+        <w:tabs>
+          <w:tab w:val="left" w:pos="5020"/>
+        </w:tabs>
+        <w:spacing w:line="226" w:lineRule="auto"/>
+        <w:ind w:left="5760" w:hanging="2360"/>
+        <w:rPr>
+          <w:rFonts w:ascii="Verdana" w:hAnsi="Verdana"/>
+          <w:sz w:val="20"/>
+          <w:szCs w:val="20"/>
+        </w:rPr>
+      </w:pPr>
+      <w:r>
+        <w:rPr>
+          <w:rFonts w:ascii="Verdana" w:eastAsia="Calibri" w:hAnsi="Verdana" w:cs="Calibri"/>
+          <w:b/>
+          <w:bCs/>
+          <w:sz w:val="20"/>
+          <w:szCs w:val="20"/>
+        </w:rPr>
+        <w:t>Study Mode:</w:t>
+      </w:r>
+      <w:r>
+        <w:rPr>
+          <w:rFonts w:ascii="Verdana" w:hAnsi="Verdana"/>
+          <w:sz w:val="20"/>
+          <w:szCs w:val="20"/>
+        </w:rPr>
+        <w:t xml:space="preserve"> </w:t>
+      </w:r>
+      <w:r>
+        <w:rPr>
+          <w:rFonts w:ascii="Verdana" w:hAnsi="Verdana"/>
+          <w:sz w:val="20"/>
+          <w:szCs w:val="20"/>
+        </w:rPr>
+        <w:tab/>
+      </w:r>
+      <w:r>
+        <w:rPr>
+          <w:rFonts w:ascii="Verdana" w:hAnsi="Verdana"/>
+          <w:sz w:val="20"/>
+          <w:szCs w:val="20"/>
+        </w:rPr>
+        <w:tab/>
+      </w:r>
+      <w:r>
+        <w:rPr>
+          <w:rFonts w:ascii="Verdana" w:hAnsi="Verdana"/>
+          <w:sz w:val="20"/>
+          <w:szCs w:val="20"/>
+        </w:rPr>
+        <w:t>100% Online Distance Learning (Morning Schedule: 08:00 – 11:00)</w:t>
+      </w:r>
+    </w:p>
+    <w:p>
+      <w:pPr>
+        <w:tabs>
+          <w:tab w:val="left" w:pos="5020"/>
+        </w:tabs>
+        <w:spacing w:line="226" w:lineRule="auto"/>
+        <w:ind w:left="3400"/>
+        <w:rPr>
+          <w:rFonts w:ascii="Verdana" w:hAnsi="Verdana"/>
+          <w:sz w:val="20"/>
+          <w:szCs w:val="20"/>
+        </w:rPr>
+      </w:pPr>
+    </w:p>
+    <w:p>
+      <w:pPr>
         <w:pStyle w:val="Heading1"/>
         <w:pageBreakBefore w:val="0"/>
         <w:rPr>
@@ -1190,6 +1336,24 @@
         <w:t>Swarklip</w:t>
       </w:r>
       <w:proofErr w:type="spellEnd"/>
+      <w:r>
+        <w:rPr>
+          <w:rFonts w:ascii="Verdana" w:eastAsia="Verdana" w:hAnsi="Verdana" w:cs="Verdana"/>
+          <w:color w:val="08044A"/>
+          <w:sz w:val="20"/>
+          <w:szCs w:val="20"/>
+        </w:rPr>
+        <w:t xml:space="preserve"> </w:t>
+      </w:r>
+      <w:r>
+        <w:rPr>
+          <w:rFonts w:ascii="Verdana" w:eastAsia="Verdana" w:hAnsi="Verdana" w:cs="Verdana"/>
+          <w:color w:val="08044A"/>
+          <w:sz w:val="20"/>
+          <w:szCs w:val="20"/>
+        </w:rPr>
+        <w:t>(Thabazimbi / Waterberg District)</w:t>
+      </w:r>
       <w:r>
         <w:rPr>
           <w:rFonts w:ascii="Verdana" w:eastAsia="Verdana" w:hAnsi="Verdana" w:cs="Verdana"/>
@@ -1738,6 +1902,7 @@
           <w:sz w:val="20"/>
           <w:szCs w:val="20"/>
         </w:rPr>
+        <w:lastRenderedPageBreak/>
         <w:t>Information Systems 181 (INF181) — [Project Mark: 77.00%]</w:t>
       </w:r>
     </w:p>
@@ -3430,7 +3595,7 @@
         </w:rPr>
         <w:t xml:space="preserve">- </w:t>
       </w:r>
-      <w:hyperlink r:id="rId7" w:history="1">
+      <w:hyperlink r:id="rId8" w:history="1">
         <w:r>
           <w:rPr>
             <w:rStyle w:val="Hyperlink"/>
@@ -3496,7 +3661,7 @@
       <w:pPr>
         <w:spacing w:before="240" w:after="240"/>
       </w:pPr>
-      <w:hyperlink r:id="rId8" w:history="1">
+      <w:hyperlink r:id="rId9" w:history="1">
         <w:r>
           <w:rPr>
             <w:rStyle w:val="Hyperlink"/>
@@ -3976,7 +4141,7 @@
                     <pic:cNvPicPr/>
                   </pic:nvPicPr>
                   <pic:blipFill>
-                    <a:blip r:embed="rId9"/>
+                    <a:blip r:embed="rId10"/>
                     <a:stretch>
                       <a:fillRect/>
                     </a:stretch>
@@ -4030,7 +4195,7 @@
                     <pic:cNvPicPr/>
                   </pic:nvPicPr>
                   <pic:blipFill>
-                    <a:blip r:embed="rId10"/>
+                    <a:blip r:embed="rId11"/>
                     <a:stretch>
                       <a:fillRect/>
                     </a:stretch>
@@ -4084,7 +4249,7 @@
                     <pic:cNvPicPr/>
                   </pic:nvPicPr>
                   <pic:blipFill>
-                    <a:blip r:embed="rId11"/>
+                    <a:blip r:embed="rId12"/>
                     <a:stretch>
                       <a:fillRect/>
                     </a:stretch>
@@ -6258,7 +6423,6 @@
   <w:style w:type="character" w:default="1" w:styleId="DefaultParagraphFont">
     <w:name w:val="Default Paragraph Font"/>
     <w:uiPriority w:val="1"/>
-    <w:semiHidden/>
     <w:unhideWhenUsed/>
   </w:style>
   <w:style w:type="table" w:default="1" w:styleId="TableNormal">

</xml_diff>